<commit_message>
Add Bar support for default html builder, small refac
</commit_message>
<xml_diff>
--- a/tests/examples/formulas.docx
+++ b/tests/examples/formulas.docx
@@ -3,6 +3,11 @@
 <w:document xmlns:wpc="http://schemas.microsoft.com/office/word/2010/wordprocessingCanvas" xmlns:cx="http://schemas.microsoft.com/office/drawing/2014/chartex" xmlns:cx1="http://schemas.microsoft.com/office/drawing/2015/9/8/chartex" xmlns:cx2="http://schemas.microsoft.com/office/drawing/2015/10/21/chartex" xmlns:cx3="http://schemas.microsoft.com/office/drawing/2016/5/9/chartex" xmlns:cx4="http://schemas.microsoft.com/office/drawing/2016/5/10/chartex" xmlns:cx5="http://schemas.microsoft.com/office/drawing/2016/5/11/chartex" xmlns:cx6="http://schemas.microsoft.com/office/drawing/2016/5/12/chartex" xmlns:cx7="http://schemas.microsoft.com/office/drawing/2016/5/13/chartex" xmlns:cx8="http://schemas.microsoft.com/office/drawing/2016/5/14/chartex" xmlns:mc="http://schemas.openxmlformats.org/markup-compatibility/2006" xmlns:aink="http://schemas.microsoft.com/office/drawing/2016/ink" xmlns:am3d="http://schemas.microsoft.com/office/drawing/2017/model3d" xmlns:o="urn:schemas-microsoft-com:office:office" xmlns:r="http://schemas.openxmlformats.org/officeDocument/2006/relationships" xmlns:m="http://schemas.openxmlformats.org/officeDocument/2006/math" xmlns:v="urn:schemas-microsoft-com:vml" xmlns:wp14="http://schemas.microsoft.com/office/word/2010/wordprocessingDrawing" xmlns:wp="http://schemas.openxmlformats.org/drawingml/2006/wordprocessingDrawing" xmlns:w10="urn:schemas-microsoft-com:office:word" xmlns:w="http://schemas.openxmlformats.org/wordprocessingml/2006/main" xmlns:w14="http://schemas.microsoft.com/office/word/2010/wordml" xmlns:w15="http://schemas.microsoft.com/office/word/2012/wordml" xmlns:w16cex="http://schemas.microsoft.com/office/word/2018/wordml/cex" xmlns:w16cid="http://schemas.microsoft.com/office/word/2016/wordml/cid" xmlns:w16="http://schemas.microsoft.com/office/word/2018/wordml" xmlns:w16se="http://schemas.microsoft.com/office/word/2015/wordml/symex" xmlns:wpg="http://schemas.microsoft.com/office/word/2010/wordprocessingGroup" xmlns:wpi="http://schemas.microsoft.com/office/word/2010/wordprocessingInk" xmlns:wne="http://schemas.microsoft.com/office/word/2006/wordml" xmlns:wps="http://schemas.microsoft.com/office/word/2010/wordprocessingShape" mc:Ignorable="w14 w15 w16se w16cid w16 w16cex wp14">
   <w:body>
     <w:p>
+      <w:pPr>
+        <w:rPr>
+          <w:lang w:val="en-US"/>
+        </w:rPr>
+      </w:pPr>
       <m:oMathPara>
         <m:oMath>
           <m:acc>
@@ -16,22 +21,42 @@
               </m:ctrlPr>
             </m:accPr>
             <m:e>
-              <w:bookmarkStart w:id="0" w:name="_GoBack"/>
               <m:r>
                 <w:rPr>
                   <w:rFonts w:ascii="Cambria Math" w:hAnsi="Cambria Math"/>
                 </w:rPr>
                 <m:t>ААА</m:t>
               </m:r>
-              <w:bookmarkEnd w:id="0"/>
             </m:e>
           </m:acc>
           <m:r>
             <w:rPr>
               <w:rFonts w:ascii="Cambria Math" w:hAnsi="Cambria Math"/>
+              <w:lang w:val="en-US"/>
             </w:rPr>
             <m:t xml:space="preserve"> </m:t>
           </m:r>
+          <m:bar>
+            <m:barPr>
+              <m:pos m:val="top"/>
+              <m:ctrlPr>
+                <w:rPr>
+                  <w:rFonts w:ascii="Cambria Math" w:hAnsi="Cambria Math"/>
+                  <w:i/>
+                  <w:lang w:val="en-US"/>
+                </w:rPr>
+              </m:ctrlPr>
+            </m:barPr>
+            <m:e>
+              <m:r>
+                <w:rPr>
+                  <w:rFonts w:ascii="Cambria Math" w:hAnsi="Cambria Math"/>
+                  <w:lang w:val="en-US"/>
+                </w:rPr>
+                <m:t>BBB</m:t>
+              </m:r>
+            </m:e>
+          </m:bar>
           <m:r>
             <w:rPr>
               <w:rFonts w:ascii="Cambria Math" w:hAnsi="Cambria Math"/>
@@ -58,6 +83,7 @@
           <m:r>
             <w:rPr>
               <w:rFonts w:ascii="Cambria Math" w:hAnsi="Cambria Math"/>
+              <w:lang w:val="en-US"/>
             </w:rPr>
             <m:t>=</m:t>
           </m:r>
@@ -81,6 +107,7 @@
               <m:r>
                 <w:rPr>
                   <w:rFonts w:ascii="Cambria Math" w:hAnsi="Cambria Math"/>
+                  <w:lang w:val="en-US"/>
                 </w:rPr>
                 <m:t>0</m:t>
               </m:r>
@@ -89,9 +116,12 @@
           <m:r>
             <w:rPr>
               <w:rFonts w:ascii="Cambria Math" w:hAnsi="Cambria Math"/>
+              <w:lang w:val="en-US"/>
             </w:rPr>
             <m:t>+</m:t>
           </m:r>
+          <w:bookmarkStart w:id="0" w:name="_GoBack"/>
+          <w:bookmarkEnd w:id="0"/>
           <m:nary>
             <m:naryPr>
               <m:chr m:val="∑"/>
@@ -107,13 +137,21 @@
                 <w:rPr>
                   <w:rFonts w:ascii="Cambria Math" w:hAnsi="Cambria Math"/>
                 </w:rPr>
-                <m:t>n=1</m:t>
+                <m:t>n</m:t>
+              </m:r>
+              <m:r>
+                <w:rPr>
+                  <w:rFonts w:ascii="Cambria Math" w:hAnsi="Cambria Math"/>
+                  <w:lang w:val="en-US"/>
+                </w:rPr>
+                <m:t>=1</m:t>
               </m:r>
             </m:sub>
             <m:sup>
               <m:r>
                 <w:rPr>
                   <w:rFonts w:ascii="Cambria Math" w:hAnsi="Cambria Math"/>
+                  <w:lang w:val="en-US"/>
                 </w:rPr>
                 <m:t>∞</m:t>
               </m:r>
@@ -168,6 +206,7 @@
                         </m:rPr>
                         <w:rPr>
                           <w:rFonts w:ascii="Cambria Math" w:eastAsia="Cambria Math" w:hAnsi="Cambria Math" w:cs="Cambria Math"/>
+                          <w:lang w:val="en-US"/>
                         </w:rPr>
                         <m:t>cos</m:t>
                       </m:r>
@@ -203,6 +242,7 @@
                   <m:r>
                     <w:rPr>
                       <w:rFonts w:ascii="Cambria Math" w:eastAsia="Cambria Math" w:hAnsi="Cambria Math" w:cs="Cambria Math"/>
+                      <w:lang w:val="en-US"/>
                     </w:rPr>
                     <m:t>+</m:t>
                   </m:r>
@@ -246,6 +286,7 @@
                         </m:rPr>
                         <w:rPr>
                           <w:rFonts w:ascii="Cambria Math" w:eastAsia="Cambria Math" w:hAnsi="Cambria Math" w:cs="Cambria Math"/>
+                          <w:lang w:val="en-US"/>
                         </w:rPr>
                         <m:t>sin</m:t>
                       </m:r>

</xml_diff>

<commit_message>
Add officemath2latex with simple conversion to latex + process drawing from me
</commit_message>
<xml_diff>
--- a/tests/examples/formulas.docx
+++ b/tests/examples/formulas.docx
@@ -2,6 +2,121 @@
 <file path=word/document.xml><?xml version="1.0" encoding="utf-8"?>
 <w:document xmlns:wpc="http://schemas.microsoft.com/office/word/2010/wordprocessingCanvas" xmlns:cx="http://schemas.microsoft.com/office/drawing/2014/chartex" xmlns:cx1="http://schemas.microsoft.com/office/drawing/2015/9/8/chartex" xmlns:cx2="http://schemas.microsoft.com/office/drawing/2015/10/21/chartex" xmlns:cx3="http://schemas.microsoft.com/office/drawing/2016/5/9/chartex" xmlns:cx4="http://schemas.microsoft.com/office/drawing/2016/5/10/chartex" xmlns:cx5="http://schemas.microsoft.com/office/drawing/2016/5/11/chartex" xmlns:cx6="http://schemas.microsoft.com/office/drawing/2016/5/12/chartex" xmlns:cx7="http://schemas.microsoft.com/office/drawing/2016/5/13/chartex" xmlns:cx8="http://schemas.microsoft.com/office/drawing/2016/5/14/chartex" xmlns:mc="http://schemas.openxmlformats.org/markup-compatibility/2006" xmlns:aink="http://schemas.microsoft.com/office/drawing/2016/ink" xmlns:am3d="http://schemas.microsoft.com/office/drawing/2017/model3d" xmlns:o="urn:schemas-microsoft-com:office:office" xmlns:r="http://schemas.openxmlformats.org/officeDocument/2006/relationships" xmlns:m="http://schemas.openxmlformats.org/officeDocument/2006/math" xmlns:v="urn:schemas-microsoft-com:vml" xmlns:wp14="http://schemas.microsoft.com/office/word/2010/wordprocessingDrawing" xmlns:wp="http://schemas.openxmlformats.org/drawingml/2006/wordprocessingDrawing" xmlns:w10="urn:schemas-microsoft-com:office:word" xmlns:w="http://schemas.openxmlformats.org/wordprocessingml/2006/main" xmlns:w14="http://schemas.microsoft.com/office/word/2010/wordml" xmlns:w15="http://schemas.microsoft.com/office/word/2012/wordml" xmlns:w16cex="http://schemas.microsoft.com/office/word/2018/wordml/cex" xmlns:w16cid="http://schemas.microsoft.com/office/word/2016/wordml/cid" xmlns:w16="http://schemas.microsoft.com/office/word/2018/wordml" xmlns:w16se="http://schemas.microsoft.com/office/word/2015/wordml/symex" xmlns:wpg="http://schemas.microsoft.com/office/word/2010/wordprocessingGroup" xmlns:wpi="http://schemas.microsoft.com/office/word/2010/wordprocessingInk" xmlns:wne="http://schemas.microsoft.com/office/word/2006/wordml" xmlns:wps="http://schemas.microsoft.com/office/word/2010/wordprocessingShape" mc:Ignorable="w14 w15 w16se w16cid w16 w16cex wp14">
   <w:body>
+    <w:p>
+      <w:pPr>
+        <w:rPr>
+          <w:rFonts w:eastAsiaTheme="minorEastAsia"/>
+        </w:rPr>
+      </w:pPr>
+      <m:oMathPara>
+        <m:oMath>
+          <m:f>
+            <m:fPr>
+              <m:ctrlPr>
+                <w:rPr>
+                  <w:rFonts w:ascii="Cambria Math" w:eastAsiaTheme="minorEastAsia" w:hAnsi="Cambria Math"/>
+                  <w:i/>
+                </w:rPr>
+              </m:ctrlPr>
+            </m:fPr>
+            <m:num>
+              <m:r>
+                <w:rPr>
+                  <w:rFonts w:ascii="Cambria Math" w:eastAsiaTheme="minorEastAsia" w:hAnsi="Cambria Math"/>
+                  <w:i/>
+                  <w:noProof/>
+                </w:rPr>
+                <w:drawing>
+                  <wp:inline distT="0" distB="0" distL="0" distR="0" wp14:anchorId="2E8FECDD" wp14:editId="627E9B8C">
+                    <wp:extent cx="876422" cy="161948"/>
+                    <wp:effectExtent l="0" t="0" r="0" b="9525"/>
+                    <wp:docPr id="3" name="Рисунок 3"/>
+                    <wp:cNvGraphicFramePr>
+                      <a:graphicFrameLocks xmlns:a="http://schemas.openxmlformats.org/drawingml/2006/main" noChangeAspect="1"/>
+                    </wp:cNvGraphicFramePr>
+                    <a:graphic xmlns:a="http://schemas.openxmlformats.org/drawingml/2006/main">
+                      <a:graphicData uri="http://schemas.openxmlformats.org/drawingml/2006/picture">
+                        <pic:pic xmlns:pic="http://schemas.openxmlformats.org/drawingml/2006/picture">
+                          <pic:nvPicPr>
+                            <pic:cNvPr id="1" name=""/>
+                            <pic:cNvPicPr/>
+                          </pic:nvPicPr>
+                          <pic:blipFill>
+                            <a:blip r:embed="rId5"/>
+                            <a:stretch>
+                              <a:fillRect/>
+                            </a:stretch>
+                          </pic:blipFill>
+                          <pic:spPr>
+                            <a:xfrm>
+                              <a:off x="0" y="0"/>
+                              <a:ext cx="876422" cy="161948"/>
+                            </a:xfrm>
+                            <a:prstGeom prst="rect">
+                              <a:avLst/>
+                            </a:prstGeom>
+                          </pic:spPr>
+                        </pic:pic>
+                      </a:graphicData>
+                    </a:graphic>
+                  </wp:inline>
+                </w:drawing>
+              </m:r>
+              <m:r>
+                <w:rPr>
+                  <w:rFonts w:ascii="Cambria Math" w:eastAsiaTheme="minorEastAsia" w:hAnsi="Cambria Math"/>
+                </w:rPr>
+                <m:t>ff</m:t>
+              </m:r>
+            </m:num>
+            <m:den>
+              <m:r>
+                <w:rPr>
+                  <w:rFonts w:ascii="Cambria Math" w:eastAsiaTheme="minorEastAsia" w:hAnsi="Cambria Math"/>
+                  <w:i/>
+                  <w:noProof/>
+                </w:rPr>
+                <w:drawing>
+                  <wp:inline distT="0" distB="0" distL="0" distR="0" wp14:anchorId="6FF3EDDC" wp14:editId="7BF8FDB7">
+                    <wp:extent cx="876422" cy="161948"/>
+                    <wp:effectExtent l="0" t="0" r="0" b="9525"/>
+                    <wp:docPr id="4" name="Рисунок 4"/>
+                    <wp:cNvGraphicFramePr>
+                      <a:graphicFrameLocks xmlns:a="http://schemas.openxmlformats.org/drawingml/2006/main" noChangeAspect="1"/>
+                    </wp:cNvGraphicFramePr>
+                    <a:graphic xmlns:a="http://schemas.openxmlformats.org/drawingml/2006/main">
+                      <a:graphicData uri="http://schemas.openxmlformats.org/drawingml/2006/picture">
+                        <pic:pic xmlns:pic="http://schemas.openxmlformats.org/drawingml/2006/picture">
+                          <pic:nvPicPr>
+                            <pic:cNvPr id="1" name=""/>
+                            <pic:cNvPicPr/>
+                          </pic:nvPicPr>
+                          <pic:blipFill>
+                            <a:blip r:embed="rId5"/>
+                            <a:stretch>
+                              <a:fillRect/>
+                            </a:stretch>
+                          </pic:blipFill>
+                          <pic:spPr>
+                            <a:xfrm>
+                              <a:off x="0" y="0"/>
+                              <a:ext cx="876422" cy="161948"/>
+                            </a:xfrm>
+                            <a:prstGeom prst="rect">
+                              <a:avLst/>
+                            </a:prstGeom>
+                          </pic:spPr>
+                        </pic:pic>
+                      </a:graphicData>
+                    </a:graphic>
+                  </wp:inline>
+                </w:drawing>
+              </m:r>
+            </m:den>
+          </m:f>
+        </m:oMath>
+      </m:oMathPara>
+    </w:p>
     <w:p>
       <w:pPr>
         <w:rPr>
@@ -48,6 +163,107 @@
               </m:ctrlPr>
             </m:barPr>
             <m:e>
+              <m:f>
+                <m:fPr>
+                  <m:ctrlPr>
+                    <w:rPr>
+                      <w:rFonts w:ascii="Cambria Math" w:hAnsi="Cambria Math"/>
+                      <w:i/>
+                      <w:lang w:val="en-US"/>
+                    </w:rPr>
+                  </m:ctrlPr>
+                </m:fPr>
+                <m:num>
+                  <m:r>
+                    <w:rPr>
+                      <w:rFonts w:ascii="Cambria Math" w:hAnsi="Cambria Math"/>
+                      <w:i/>
+                      <w:noProof/>
+                      <w:lang w:val="en-US"/>
+                    </w:rPr>
+                    <w:drawing>
+                      <wp:inline distT="0" distB="0" distL="0" distR="0" wp14:anchorId="1FD10BDF" wp14:editId="31C13398">
+                        <wp:extent cx="876422" cy="161948"/>
+                        <wp:effectExtent l="0" t="0" r="0" b="9525"/>
+                        <wp:docPr id="1" name="Рисунок 1"/>
+                        <wp:cNvGraphicFramePr>
+                          <a:graphicFrameLocks xmlns:a="http://schemas.openxmlformats.org/drawingml/2006/main" noChangeAspect="1"/>
+                        </wp:cNvGraphicFramePr>
+                        <a:graphic xmlns:a="http://schemas.openxmlformats.org/drawingml/2006/main">
+                          <a:graphicData uri="http://schemas.openxmlformats.org/drawingml/2006/picture">
+                            <pic:pic xmlns:pic="http://schemas.openxmlformats.org/drawingml/2006/picture">
+                              <pic:nvPicPr>
+                                <pic:cNvPr id="1" name=""/>
+                                <pic:cNvPicPr/>
+                              </pic:nvPicPr>
+                              <pic:blipFill>
+                                <a:blip r:embed="rId5"/>
+                                <a:stretch>
+                                  <a:fillRect/>
+                                </a:stretch>
+                              </pic:blipFill>
+                              <pic:spPr>
+                                <a:xfrm>
+                                  <a:off x="0" y="0"/>
+                                  <a:ext cx="876422" cy="161948"/>
+                                </a:xfrm>
+                                <a:prstGeom prst="rect">
+                                  <a:avLst/>
+                                </a:prstGeom>
+                              </pic:spPr>
+                            </pic:pic>
+                          </a:graphicData>
+                        </a:graphic>
+                      </wp:inline>
+                    </w:drawing>
+                  </m:r>
+                </m:num>
+                <m:den>
+                  <m:r>
+                    <w:rPr>
+                      <w:rFonts w:ascii="Cambria Math" w:hAnsi="Cambria Math"/>
+                      <w:i/>
+                      <w:noProof/>
+                      <w:lang w:val="en-US"/>
+                    </w:rPr>
+                    <w:drawing>
+                      <wp:inline distT="0" distB="0" distL="0" distR="0" wp14:anchorId="63003FC1" wp14:editId="1B9AAB47">
+                        <wp:extent cx="876422" cy="161948"/>
+                        <wp:effectExtent l="0" t="0" r="0" b="9525"/>
+                        <wp:docPr id="2" name="Рисунок 2"/>
+                        <wp:cNvGraphicFramePr>
+                          <a:graphicFrameLocks xmlns:a="http://schemas.openxmlformats.org/drawingml/2006/main" noChangeAspect="1"/>
+                        </wp:cNvGraphicFramePr>
+                        <a:graphic xmlns:a="http://schemas.openxmlformats.org/drawingml/2006/main">
+                          <a:graphicData uri="http://schemas.openxmlformats.org/drawingml/2006/picture">
+                            <pic:pic xmlns:pic="http://schemas.openxmlformats.org/drawingml/2006/picture">
+                              <pic:nvPicPr>
+                                <pic:cNvPr id="1" name=""/>
+                                <pic:cNvPicPr/>
+                              </pic:nvPicPr>
+                              <pic:blipFill>
+                                <a:blip r:embed="rId5"/>
+                                <a:stretch>
+                                  <a:fillRect/>
+                                </a:stretch>
+                              </pic:blipFill>
+                              <pic:spPr>
+                                <a:xfrm>
+                                  <a:off x="0" y="0"/>
+                                  <a:ext cx="876422" cy="161948"/>
+                                </a:xfrm>
+                                <a:prstGeom prst="rect">
+                                  <a:avLst/>
+                                </a:prstGeom>
+                              </pic:spPr>
+                            </pic:pic>
+                          </a:graphicData>
+                        </a:graphic>
+                      </wp:inline>
+                    </w:drawing>
+                  </m:r>
+                </m:den>
+              </m:f>
               <m:r>
                 <w:rPr>
                   <w:rFonts w:ascii="Cambria Math" w:hAnsi="Cambria Math"/>
@@ -345,7 +561,15 @@
                 <w:rPr>
                   <w:rFonts w:ascii="Cambria Math" w:eastAsiaTheme="minorEastAsia" w:hAnsi="Cambria Math"/>
                 </w:rPr>
-                <m:t>ffffffffffffffffffffffffffffffffffffffffffffffffffffffffffffffffffffffffffffffffffffffffffffffffffffffffffffffffffffffffffffffff fffffffffffffffffffffffffffff ffffffffffffffffffffffff</m:t>
+                <m:t>ffffff</m:t>
+              </m:r>
+              <w:bookmarkStart w:id="0" w:name="_GoBack"/>
+              <w:bookmarkEnd w:id="0"/>
+              <m:r>
+                <w:rPr>
+                  <w:rFonts w:ascii="Cambria Math" w:eastAsiaTheme="minorEastAsia" w:hAnsi="Cambria Math"/>
+                </w:rPr>
+                <m:t>ffffffffffffffffffffff ffffffffffffffffffffffff</m:t>
               </m:r>
             </m:e>
           </m:box>
@@ -485,13 +709,25 @@
       </w:pPr>
       <m:oMathPara>
         <m:oMath>
+          <m:d>
+            <m:dPr>
+              <m:begChr m:val="["/>
+              <m:endChr m:val="]"/>
+              <m:ctrlPr>
+                <w:rPr>
+                  <w:rFonts w:ascii="Cambria Math" w:hAnsi="Cambria Math"/>
+                  <w:i/>
+                </w:rPr>
+              </m:ctrlPr>
+            </m:dPr>
+            <m:e/>
+          </m:d>
           <m:r>
             <w:rPr>
               <w:rFonts w:ascii="Cambria Math" w:hAnsi="Cambria Math"/>
             </w:rPr>
             <m:t>-a + b + c + d + e + l</m:t>
           </m:r>
-          <w:bookmarkStart w:id="0" w:name="_GoBack"/>
           <m:box>
             <m:boxPr>
               <m:opEmu m:val="1"/>
@@ -512,7 +748,6 @@
           </m:box>
         </m:oMath>
       </m:oMathPara>
-      <w:bookmarkEnd w:id="0"/>
     </w:p>
     <w:sectPr>
       <w:pgSz w:w="11906" w:h="16838"/>
@@ -1278,7 +1513,7 @@
 </file>
 
 <file path=customXml/itemProps1.xml><?xml version="1.0" encoding="utf-8"?>
-<ds:datastoreItem xmlns:ds="http://schemas.openxmlformats.org/officeDocument/2006/customXml" ds:itemID="{301B8521-4153-45D1-8DF5-8D4C45C8259D}">
+<ds:datastoreItem xmlns:ds="http://schemas.openxmlformats.org/officeDocument/2006/customXml" ds:itemID="{F05B436C-F8D6-435C-B68D-7FD82D8C863C}">
   <ds:schemaRefs>
     <ds:schemaRef ds:uri="http://schemas.openxmlformats.org/officeDocument/2006/bibliography"/>
   </ds:schemaRefs>

</xml_diff>